<commit_message>
All Code and Documents
</commit_message>
<xml_diff>
--- a/docs/02_Requirements/ChatbotBuilder_Requirement_Document.docx
+++ b/docs/02_Requirements/ChatbotBuilder_Requirement_Document.docx
@@ -187,7 +187,15 @@
         <w:jc w:val="both"/>
       </w:pPr>
       <w:r>
-        <w:t>The Chatbot Builder Application is a web-based platform that allows users to create, customize, test, and deploy AI-powered chatbots without programming knowledge.</w:t>
+        <w:t xml:space="preserve">The Chatbot Builder Application is a web-based platform that allows users to create, customize, </w:t>
+      </w:r>
+      <w:proofErr w:type="gramStart"/>
+      <w:r>
+        <w:t>test</w:t>
+      </w:r>
+      <w:proofErr w:type="gramEnd"/>
+      <w:r>
+        <w:t>, and deploy AI-powered chatbots without programming knowledge.</w:t>
       </w:r>
     </w:p>
     <w:p>
@@ -401,8 +409,13 @@
       </w:pPr>
       <w:r>
         <w:lastRenderedPageBreak/>
-        <w:t>Spring Boot documentation</w:t>
-      </w:r>
+        <w:t xml:space="preserve">Spring Boot </w:t>
+      </w:r>
+      <w:proofErr w:type="gramStart"/>
+      <w:r>
+        <w:t>documentation</w:t>
+      </w:r>
+      <w:proofErr w:type="gramEnd"/>
     </w:p>
     <w:p>
       <w:pPr>
@@ -514,8 +527,13 @@
         <w:jc w:val="both"/>
       </w:pPr>
       <w:r>
-        <w:t>Create and manage chatbots</w:t>
-      </w:r>
+        <w:t xml:space="preserve">Create and manage </w:t>
+      </w:r>
+      <w:proofErr w:type="gramStart"/>
+      <w:r>
+        <w:t>chatbots</w:t>
+      </w:r>
+      <w:proofErr w:type="gramEnd"/>
     </w:p>
     <w:p>
       <w:pPr>
@@ -527,8 +545,13 @@
         <w:jc w:val="both"/>
       </w:pPr>
       <w:r>
-        <w:t>Add knowledge sources</w:t>
-      </w:r>
+        <w:t xml:space="preserve">Add knowledge </w:t>
+      </w:r>
+      <w:proofErr w:type="gramStart"/>
+      <w:r>
+        <w:t>sources</w:t>
+      </w:r>
+      <w:proofErr w:type="gramEnd"/>
     </w:p>
     <w:p>
       <w:pPr>
@@ -539,9 +562,19 @@
         <w:spacing w:after="0" w:line="276" w:lineRule="auto"/>
         <w:jc w:val="both"/>
       </w:pPr>
-      <w:r>
-        <w:t>Test chatbot responses</w:t>
-      </w:r>
+      <w:proofErr w:type="gramStart"/>
+      <w:r>
+        <w:t>Test</w:t>
+      </w:r>
+      <w:proofErr w:type="gramEnd"/>
+      <w:r>
+        <w:t xml:space="preserve"> chatbot </w:t>
+      </w:r>
+      <w:proofErr w:type="gramStart"/>
+      <w:r>
+        <w:t>responses</w:t>
+      </w:r>
+      <w:proofErr w:type="gramEnd"/>
     </w:p>
     <w:p>
       <w:pPr>
@@ -553,8 +586,13 @@
         <w:jc w:val="both"/>
       </w:pPr>
       <w:r>
-        <w:t>Deploy chatbots</w:t>
-      </w:r>
+        <w:t xml:space="preserve">Deploy </w:t>
+      </w:r>
+      <w:proofErr w:type="gramStart"/>
+      <w:r>
+        <w:t>chatbots</w:t>
+      </w:r>
+      <w:proofErr w:type="gramEnd"/>
     </w:p>
     <w:p>
       <w:pPr>
@@ -588,8 +626,13 @@
         <w:jc w:val="both"/>
       </w:pPr>
       <w:r>
-        <w:t>Manage users</w:t>
-      </w:r>
+        <w:t xml:space="preserve">Manage </w:t>
+      </w:r>
+      <w:proofErr w:type="gramStart"/>
+      <w:r>
+        <w:t>users</w:t>
+      </w:r>
+      <w:proofErr w:type="gramEnd"/>
     </w:p>
     <w:p>
       <w:pPr>
@@ -601,8 +644,13 @@
         <w:jc w:val="both"/>
       </w:pPr>
       <w:r>
-        <w:t>Monitor system activity</w:t>
-      </w:r>
+        <w:t xml:space="preserve">Monitor system </w:t>
+      </w:r>
+      <w:proofErr w:type="gramStart"/>
+      <w:r>
+        <w:t>activity</w:t>
+      </w:r>
+      <w:proofErr w:type="gramEnd"/>
     </w:p>
     <w:p>
       <w:pPr>
@@ -614,8 +662,13 @@
         <w:jc w:val="both"/>
       </w:pPr>
       <w:r>
-        <w:t>Perform admin-level operations</w:t>
-      </w:r>
+        <w:t xml:space="preserve">Perform admin-level </w:t>
+      </w:r>
+      <w:proofErr w:type="gramStart"/>
+      <w:r>
+        <w:t>operations</w:t>
+      </w:r>
+      <w:proofErr w:type="gramEnd"/>
     </w:p>
     <w:p>
       <w:pPr>
@@ -636,8 +689,13 @@
         <w:jc w:val="both"/>
       </w:pPr>
       <w:r>
-        <w:t>Interacts with deployed chatbot via public link</w:t>
-      </w:r>
+        <w:t xml:space="preserve">Interacts with deployed chatbot via public </w:t>
+      </w:r>
+      <w:proofErr w:type="gramStart"/>
+      <w:r>
+        <w:t>link</w:t>
+      </w:r>
+      <w:proofErr w:type="gramEnd"/>
     </w:p>
     <w:p>
       <w:pPr>
@@ -721,8 +779,13 @@
         <w:jc w:val="both"/>
       </w:pPr>
       <w:r>
-        <w:t>Users have internet access</w:t>
-      </w:r>
+        <w:t xml:space="preserve">Users have internet </w:t>
+      </w:r>
+      <w:proofErr w:type="gramStart"/>
+      <w:r>
+        <w:t>access</w:t>
+      </w:r>
+      <w:proofErr w:type="gramEnd"/>
     </w:p>
     <w:p>
       <w:pPr>
@@ -734,8 +797,13 @@
         <w:jc w:val="both"/>
       </w:pPr>
       <w:r>
-        <w:t>OpenAI API is available</w:t>
-      </w:r>
+        <w:t xml:space="preserve">OpenAI API is </w:t>
+      </w:r>
+      <w:proofErr w:type="gramStart"/>
+      <w:r>
+        <w:t>available</w:t>
+      </w:r>
+      <w:proofErr w:type="gramEnd"/>
     </w:p>
     <w:p>
       <w:pPr>
@@ -747,8 +815,13 @@
         <w:jc w:val="both"/>
       </w:pPr>
       <w:r>
-        <w:t>PostgreSQL database is running</w:t>
-      </w:r>
+        <w:t xml:space="preserve">PostgreSQL database is </w:t>
+      </w:r>
+      <w:proofErr w:type="gramStart"/>
+      <w:r>
+        <w:t>running</w:t>
+      </w:r>
+      <w:proofErr w:type="gramEnd"/>
     </w:p>
     <w:p>
       <w:pPr>
@@ -824,8 +897,13 @@
         <w:jc w:val="both"/>
       </w:pPr>
       <w:r>
-        <w:t>Users can register with name, email, password, and PIN</w:t>
-      </w:r>
+        <w:t xml:space="preserve">Users can register with name, email, password, and </w:t>
+      </w:r>
+      <w:proofErr w:type="gramStart"/>
+      <w:r>
+        <w:t>PIN</w:t>
+      </w:r>
+      <w:proofErr w:type="gramEnd"/>
     </w:p>
     <w:p>
       <w:pPr>
@@ -837,8 +915,13 @@
         <w:jc w:val="both"/>
       </w:pPr>
       <w:r>
-        <w:t>Users can log in with credentials</w:t>
-      </w:r>
+        <w:t xml:space="preserve">Users can log in with </w:t>
+      </w:r>
+      <w:proofErr w:type="gramStart"/>
+      <w:r>
+        <w:t>credentials</w:t>
+      </w:r>
+      <w:proofErr w:type="gramEnd"/>
     </w:p>
     <w:p>
       <w:pPr>
@@ -850,8 +933,21 @@
         <w:jc w:val="both"/>
       </w:pPr>
       <w:r>
-        <w:t>Users can reset password using PIN</w:t>
-      </w:r>
+        <w:t xml:space="preserve">Users can reset </w:t>
+      </w:r>
+      <w:proofErr w:type="gramStart"/>
+      <w:r>
+        <w:t>password</w:t>
+      </w:r>
+      <w:proofErr w:type="gramEnd"/>
+      <w:r>
+        <w:t xml:space="preserve"> using </w:t>
+      </w:r>
+      <w:proofErr w:type="gramStart"/>
+      <w:r>
+        <w:t>PIN</w:t>
+      </w:r>
+      <w:proofErr w:type="gramEnd"/>
     </w:p>
     <w:p>
       <w:pPr>
@@ -863,8 +959,13 @@
         <w:jc w:val="both"/>
       </w:pPr>
       <w:r>
-        <w:t>Admin access requires admin code</w:t>
-      </w:r>
+        <w:t xml:space="preserve">Admin access requires admin </w:t>
+      </w:r>
+      <w:proofErr w:type="gramStart"/>
+      <w:r>
+        <w:t>code</w:t>
+      </w:r>
+      <w:proofErr w:type="gramEnd"/>
     </w:p>
     <w:p>
       <w:pPr>
@@ -929,8 +1030,13 @@
         <w:jc w:val="both"/>
       </w:pPr>
       <w:r>
-        <w:t>Users can create a chatbot</w:t>
-      </w:r>
+        <w:t xml:space="preserve">Users can create a </w:t>
+      </w:r>
+      <w:proofErr w:type="gramStart"/>
+      <w:r>
+        <w:t>chatbot</w:t>
+      </w:r>
+      <w:proofErr w:type="gramEnd"/>
     </w:p>
     <w:p>
       <w:pPr>
@@ -942,8 +1048,21 @@
         <w:jc w:val="both"/>
       </w:pPr>
       <w:r>
-        <w:t>Users can provide chatbot name and description</w:t>
-      </w:r>
+        <w:t xml:space="preserve">Users can provide chatbot </w:t>
+      </w:r>
+      <w:proofErr w:type="gramStart"/>
+      <w:r>
+        <w:t>name</w:t>
+      </w:r>
+      <w:proofErr w:type="gramEnd"/>
+      <w:r>
+        <w:t xml:space="preserve"> and </w:t>
+      </w:r>
+      <w:proofErr w:type="gramStart"/>
+      <w:r>
+        <w:t>description</w:t>
+      </w:r>
+      <w:proofErr w:type="gramEnd"/>
     </w:p>
     <w:p>
       <w:pPr>
@@ -1021,8 +1140,13 @@
         <w:jc w:val="both"/>
       </w:pPr>
       <w:r>
-        <w:t>Users can provide a website URL</w:t>
-      </w:r>
+        <w:t xml:space="preserve">Users can provide a website </w:t>
+      </w:r>
+      <w:proofErr w:type="gramStart"/>
+      <w:r>
+        <w:t>URL</w:t>
+      </w:r>
+      <w:proofErr w:type="gramEnd"/>
     </w:p>
     <w:p>
       <w:pPr>
@@ -1034,8 +1158,13 @@
         <w:jc w:val="both"/>
       </w:pPr>
       <w:r>
-        <w:t>Users can enter manual text</w:t>
-      </w:r>
+        <w:t xml:space="preserve">Users can enter manual </w:t>
+      </w:r>
+      <w:proofErr w:type="gramStart"/>
+      <w:r>
+        <w:t>text</w:t>
+      </w:r>
+      <w:proofErr w:type="gramEnd"/>
     </w:p>
     <w:p>
       <w:pPr>
@@ -1126,7 +1255,13 @@
         <w:jc w:val="both"/>
       </w:pPr>
       <w:r>
-        <w:t>Select personality (Friendly, Professional, Support)</w:t>
+        <w:t xml:space="preserve">Select personality (Friendly, Professional, </w:t>
+      </w:r>
+      <w:r>
+        <w:t xml:space="preserve">Sales, </w:t>
+      </w:r>
+      <w:r>
+        <w:t>Support)</w:t>
       </w:r>
     </w:p>
     <w:p>
@@ -1189,7 +1324,15 @@
       </w:pPr>
       <w:r>
         <w:lastRenderedPageBreak/>
-        <w:t>Users can test chatbot responses before deployment.</w:t>
+        <w:t xml:space="preserve">Users can </w:t>
+      </w:r>
+      <w:proofErr w:type="gramStart"/>
+      <w:r>
+        <w:t>test</w:t>
+      </w:r>
+      <w:proofErr w:type="gramEnd"/>
+      <w:r>
+        <w:t xml:space="preserve"> chatbot responses before deployment.</w:t>
       </w:r>
     </w:p>
     <w:p>
@@ -1219,8 +1362,13 @@
         <w:jc w:val="both"/>
       </w:pPr>
       <w:r>
-        <w:t>Users can send messages to chatbot</w:t>
-      </w:r>
+        <w:t xml:space="preserve">Users can send messages to </w:t>
+      </w:r>
+      <w:proofErr w:type="gramStart"/>
+      <w:r>
+        <w:t>chatbot</w:t>
+      </w:r>
+      <w:proofErr w:type="gramEnd"/>
     </w:p>
     <w:p>
       <w:pPr>
@@ -1232,7 +1380,7 @@
         <w:jc w:val="both"/>
       </w:pPr>
       <w:r>
-        <w:t>System generates responses using knowledge base</w:t>
+        <w:t>System generates responses using stored knowledge chunks and OpenAI API</w:t>
       </w:r>
     </w:p>
     <w:p>
@@ -1245,8 +1393,13 @@
         <w:jc w:val="both"/>
       </w:pPr>
       <w:r>
-        <w:t>System displays responses in chat interface</w:t>
-      </w:r>
+        <w:t xml:space="preserve">System displays responses in chat </w:t>
+      </w:r>
+      <w:proofErr w:type="gramStart"/>
+      <w:r>
+        <w:t>interface</w:t>
+      </w:r>
+      <w:proofErr w:type="gramEnd"/>
     </w:p>
     <w:p>
       <w:pPr>
@@ -1311,8 +1464,13 @@
         <w:jc w:val="both"/>
       </w:pPr>
       <w:r>
-        <w:t>System generates unique token</w:t>
-      </w:r>
+        <w:t xml:space="preserve">System generates unique </w:t>
+      </w:r>
+      <w:proofErr w:type="gramStart"/>
+      <w:r>
+        <w:t>token</w:t>
+      </w:r>
+      <w:proofErr w:type="gramEnd"/>
     </w:p>
     <w:p>
       <w:pPr>
@@ -1324,8 +1482,13 @@
         <w:jc w:val="both"/>
       </w:pPr>
       <w:r>
-        <w:t>System provides public chatbot URL</w:t>
-      </w:r>
+        <w:t xml:space="preserve">System provides public chatbot </w:t>
+      </w:r>
+      <w:proofErr w:type="gramStart"/>
+      <w:r>
+        <w:t>URL</w:t>
+      </w:r>
+      <w:proofErr w:type="gramEnd"/>
     </w:p>
     <w:p>
       <w:pPr>
@@ -1337,8 +1500,13 @@
         <w:jc w:val="both"/>
       </w:pPr>
       <w:r>
-        <w:t>Public users can interact without login</w:t>
-      </w:r>
+        <w:t xml:space="preserve">Public users can interact without </w:t>
+      </w:r>
+      <w:proofErr w:type="gramStart"/>
+      <w:r>
+        <w:t>login</w:t>
+      </w:r>
+      <w:proofErr w:type="gramEnd"/>
     </w:p>
     <w:p>
       <w:pPr>
@@ -1403,8 +1571,13 @@
         <w:jc w:val="both"/>
       </w:pPr>
       <w:r>
-        <w:t>Users can send messages</w:t>
-      </w:r>
+        <w:t xml:space="preserve">Users can send </w:t>
+      </w:r>
+      <w:proofErr w:type="gramStart"/>
+      <w:r>
+        <w:t>messages</w:t>
+      </w:r>
+      <w:proofErr w:type="gramEnd"/>
     </w:p>
     <w:p>
       <w:pPr>
@@ -1416,8 +1589,13 @@
         <w:jc w:val="both"/>
       </w:pPr>
       <w:r>
-        <w:t>System maintains session ID</w:t>
-      </w:r>
+        <w:t xml:space="preserve">System maintains session </w:t>
+      </w:r>
+      <w:proofErr w:type="gramStart"/>
+      <w:r>
+        <w:t>ID</w:t>
+      </w:r>
+      <w:proofErr w:type="gramEnd"/>
     </w:p>
     <w:p>
       <w:pPr>
@@ -1495,8 +1673,13 @@
         <w:jc w:val="both"/>
       </w:pPr>
       <w:r>
-        <w:t>Display total conversations</w:t>
-      </w:r>
+        <w:t xml:space="preserve">Display total </w:t>
+      </w:r>
+      <w:proofErr w:type="gramStart"/>
+      <w:r>
+        <w:t>conversations</w:t>
+      </w:r>
+      <w:proofErr w:type="gramEnd"/>
     </w:p>
     <w:p>
       <w:pPr>
@@ -1508,8 +1691,13 @@
         <w:jc w:val="both"/>
       </w:pPr>
       <w:r>
-        <w:t>Display active bots</w:t>
-      </w:r>
+        <w:t xml:space="preserve">Display active </w:t>
+      </w:r>
+      <w:proofErr w:type="gramStart"/>
+      <w:r>
+        <w:t>bots</w:t>
+      </w:r>
+      <w:proofErr w:type="gramEnd"/>
     </w:p>
     <w:p>
       <w:pPr>
@@ -1521,8 +1709,13 @@
         <w:jc w:val="both"/>
       </w:pPr>
       <w:r>
-        <w:t>Display average messages per chat</w:t>
-      </w:r>
+        <w:t xml:space="preserve">Display average messages per </w:t>
+      </w:r>
+      <w:proofErr w:type="gramStart"/>
+      <w:r>
+        <w:t>chat</w:t>
+      </w:r>
+      <w:proofErr w:type="gramEnd"/>
     </w:p>
     <w:p>
       <w:pPr>
@@ -1534,8 +1727,13 @@
         <w:jc w:val="both"/>
       </w:pPr>
       <w:r>
-        <w:t>Show recent activity</w:t>
-      </w:r>
+        <w:t xml:space="preserve">Show recent </w:t>
+      </w:r>
+      <w:proofErr w:type="gramStart"/>
+      <w:r>
+        <w:t>activity</w:t>
+      </w:r>
+      <w:proofErr w:type="gramEnd"/>
     </w:p>
     <w:p>
       <w:pPr>
@@ -1547,8 +1745,13 @@
         <w:jc w:val="both"/>
       </w:pPr>
       <w:r>
-        <w:t>Show conversation trends</w:t>
-      </w:r>
+        <w:t xml:space="preserve">Show conversation </w:t>
+      </w:r>
+      <w:proofErr w:type="gramStart"/>
+      <w:r>
+        <w:t>trends</w:t>
+      </w:r>
+      <w:proofErr w:type="gramEnd"/>
     </w:p>
     <w:p>
       <w:pPr>
@@ -1557,7 +1760,64 @@
         <w:jc w:val="both"/>
       </w:pPr>
       <w:r>
-        <w:t>4. Non-Functional Requirements</w:t>
+        <w:t xml:space="preserve">4. </w:t>
+      </w:r>
+      <w:r>
+        <w:t>Actors vs Features mapping</w:t>
+      </w:r>
+    </w:p>
+    <w:p>
+      <w:pPr>
+        <w:spacing w:after="0"/>
+      </w:pPr>
+      <w:r>
+        <w:t xml:space="preserve">User → Create bot, test, publish, </w:t>
+      </w:r>
+      <w:proofErr w:type="gramStart"/>
+      <w:r>
+        <w:t>analytics</w:t>
+      </w:r>
+      <w:proofErr w:type="gramEnd"/>
+    </w:p>
+    <w:p>
+      <w:pPr>
+        <w:spacing w:after="0"/>
+      </w:pPr>
+      <w:r>
+        <w:t xml:space="preserve">Admin → Monitor system, reset </w:t>
+      </w:r>
+      <w:proofErr w:type="gramStart"/>
+      <w:r>
+        <w:t>users</w:t>
+      </w:r>
+      <w:proofErr w:type="gramEnd"/>
+    </w:p>
+    <w:p>
+      <w:pPr>
+        <w:spacing w:after="0"/>
+      </w:pPr>
+      <w:r>
+        <w:t>Public User → Chat with bot</w:t>
+      </w:r>
+    </w:p>
+    <w:p>
+      <w:pPr>
+        <w:spacing w:after="0" w:line="276" w:lineRule="auto"/>
+        <w:jc w:val="both"/>
+      </w:pPr>
+    </w:p>
+    <w:p>
+      <w:pPr>
+        <w:pStyle w:val="Heading1"/>
+        <w:spacing w:after="0" w:line="276" w:lineRule="auto"/>
+        <w:jc w:val="both"/>
+      </w:pPr>
+      <w:r>
+        <w:lastRenderedPageBreak/>
+        <w:t>5</w:t>
+      </w:r>
+      <w:r>
+        <w:t>. Non-Functional Requirements</w:t>
       </w:r>
     </w:p>
     <w:p>
@@ -1567,7 +1827,10 @@
         <w:jc w:val="both"/>
       </w:pPr>
       <w:r>
-        <w:t>4.1 Performance</w:t>
+        <w:t>5</w:t>
+      </w:r>
+      <w:r>
+        <w:t>.1 Performance</w:t>
       </w:r>
     </w:p>
     <w:p>
@@ -1580,8 +1843,13 @@
         <w:jc w:val="both"/>
       </w:pPr>
       <w:r>
-        <w:t>System should respond within 2–5 seconds</w:t>
-      </w:r>
+        <w:t xml:space="preserve">System should respond within 2–5 </w:t>
+      </w:r>
+      <w:proofErr w:type="gramStart"/>
+      <w:r>
+        <w:t>seconds</w:t>
+      </w:r>
+      <w:proofErr w:type="gramEnd"/>
     </w:p>
     <w:p>
       <w:pPr>
@@ -1593,8 +1861,13 @@
         <w:jc w:val="both"/>
       </w:pPr>
       <w:r>
-        <w:t>Support multiple concurrent users</w:t>
-      </w:r>
+        <w:t xml:space="preserve">Support multiple concurrent </w:t>
+      </w:r>
+      <w:proofErr w:type="gramStart"/>
+      <w:r>
+        <w:t>users</w:t>
+      </w:r>
+      <w:proofErr w:type="gramEnd"/>
     </w:p>
     <w:p>
       <w:pPr>
@@ -1603,155 +1876,419 @@
         <w:jc w:val="both"/>
       </w:pPr>
       <w:r>
+        <w:t>5</w:t>
+      </w:r>
+      <w:r>
+        <w:t>.2 Security</w:t>
+      </w:r>
+    </w:p>
+    <w:p>
+      <w:pPr>
+        <w:numPr>
+          <w:ilvl w:val="0"/>
+          <w:numId w:val="19"/>
+        </w:numPr>
+        <w:spacing w:after="0" w:line="276" w:lineRule="auto"/>
+        <w:jc w:val="both"/>
+      </w:pPr>
+      <w:r>
+        <w:t xml:space="preserve">Passwords must be securely </w:t>
+      </w:r>
+      <w:proofErr w:type="gramStart"/>
+      <w:r>
+        <w:t>stored</w:t>
+      </w:r>
+      <w:proofErr w:type="gramEnd"/>
+    </w:p>
+    <w:p>
+      <w:pPr>
+        <w:numPr>
+          <w:ilvl w:val="0"/>
+          <w:numId w:val="19"/>
+        </w:numPr>
+        <w:spacing w:after="0" w:line="276" w:lineRule="auto"/>
+        <w:jc w:val="both"/>
+      </w:pPr>
+      <w:r>
+        <w:t xml:space="preserve">Admin features </w:t>
+      </w:r>
+      <w:proofErr w:type="gramStart"/>
+      <w:r>
+        <w:t>restricted</w:t>
+      </w:r>
+      <w:proofErr w:type="gramEnd"/>
+    </w:p>
+    <w:p>
+      <w:pPr>
+        <w:numPr>
+          <w:ilvl w:val="0"/>
+          <w:numId w:val="19"/>
+        </w:numPr>
+        <w:spacing w:after="0" w:line="276" w:lineRule="auto"/>
+        <w:jc w:val="both"/>
+      </w:pPr>
+      <w:r>
+        <w:t>Session-based tracking</w:t>
+      </w:r>
+    </w:p>
+    <w:p>
+      <w:pPr>
+        <w:pStyle w:val="Heading2"/>
+        <w:spacing w:after="0" w:line="276" w:lineRule="auto"/>
+        <w:jc w:val="both"/>
+      </w:pPr>
+      <w:r>
+        <w:t>5</w:t>
+      </w:r>
+      <w:r>
+        <w:t>.3 Usability</w:t>
+      </w:r>
+    </w:p>
+    <w:p>
+      <w:pPr>
+        <w:numPr>
+          <w:ilvl w:val="0"/>
+          <w:numId w:val="20"/>
+        </w:numPr>
+        <w:spacing w:after="0" w:line="276" w:lineRule="auto"/>
+        <w:jc w:val="both"/>
+      </w:pPr>
+      <w:r>
+        <w:t>Simple and intuitive UI</w:t>
+      </w:r>
+    </w:p>
+    <w:p>
+      <w:pPr>
+        <w:numPr>
+          <w:ilvl w:val="0"/>
+          <w:numId w:val="20"/>
+        </w:numPr>
+        <w:spacing w:after="0" w:line="276" w:lineRule="auto"/>
+        <w:jc w:val="both"/>
+      </w:pPr>
+      <w:r>
+        <w:t>Step-by-step chatbot creation</w:t>
+      </w:r>
+    </w:p>
+    <w:p>
+      <w:pPr>
+        <w:numPr>
+          <w:ilvl w:val="0"/>
+          <w:numId w:val="20"/>
+        </w:numPr>
+        <w:spacing w:after="0" w:line="276" w:lineRule="auto"/>
+        <w:jc w:val="both"/>
+      </w:pPr>
+      <w:r>
+        <w:t>Responsive design</w:t>
+      </w:r>
+    </w:p>
+    <w:p>
+      <w:pPr>
+        <w:pStyle w:val="Heading2"/>
+        <w:spacing w:after="0" w:line="276" w:lineRule="auto"/>
+        <w:jc w:val="both"/>
+      </w:pPr>
+      <w:r>
+        <w:t>5</w:t>
+      </w:r>
+      <w:r>
+        <w:t>.4 Reliability</w:t>
+      </w:r>
+    </w:p>
+    <w:p>
+      <w:pPr>
+        <w:numPr>
+          <w:ilvl w:val="0"/>
+          <w:numId w:val="21"/>
+        </w:numPr>
+        <w:spacing w:after="0" w:line="276" w:lineRule="auto"/>
+        <w:jc w:val="both"/>
+      </w:pPr>
+      <w:r>
+        <w:t xml:space="preserve">System should </w:t>
+      </w:r>
+      <w:proofErr w:type="gramStart"/>
+      <w:r>
+        <w:t>handle</w:t>
+      </w:r>
+      <w:proofErr w:type="gramEnd"/>
+      <w:r>
+        <w:t xml:space="preserve"> failures </w:t>
+      </w:r>
+      <w:proofErr w:type="gramStart"/>
+      <w:r>
+        <w:t>gracefully</w:t>
+      </w:r>
+      <w:proofErr w:type="gramEnd"/>
+    </w:p>
+    <w:p>
+      <w:pPr>
+        <w:numPr>
+          <w:ilvl w:val="0"/>
+          <w:numId w:val="21"/>
+        </w:numPr>
+        <w:spacing w:after="0" w:line="276" w:lineRule="auto"/>
+        <w:jc w:val="both"/>
+      </w:pPr>
+      <w:r>
+        <w:t xml:space="preserve">Fallback response if AI </w:t>
+      </w:r>
+      <w:proofErr w:type="gramStart"/>
+      <w:r>
+        <w:t>fails</w:t>
+      </w:r>
+      <w:proofErr w:type="gramEnd"/>
+    </w:p>
+    <w:p>
+      <w:pPr>
+        <w:pStyle w:val="Heading2"/>
+        <w:spacing w:after="0" w:line="276" w:lineRule="auto"/>
+        <w:jc w:val="both"/>
+      </w:pPr>
+      <w:r>
+        <w:t>5</w:t>
+      </w:r>
+      <w:r>
+        <w:t>.5 Scalability</w:t>
+      </w:r>
+    </w:p>
+    <w:p>
+      <w:pPr>
+        <w:numPr>
+          <w:ilvl w:val="0"/>
+          <w:numId w:val="22"/>
+        </w:numPr>
+        <w:spacing w:after="0" w:line="276" w:lineRule="auto"/>
+        <w:jc w:val="both"/>
+      </w:pPr>
+      <w:r>
+        <w:t xml:space="preserve">System should support increasing number of users and </w:t>
+      </w:r>
+      <w:proofErr w:type="gramStart"/>
+      <w:r>
+        <w:t>bots</w:t>
+      </w:r>
+      <w:proofErr w:type="gramEnd"/>
+    </w:p>
+    <w:p>
+      <w:pPr>
+        <w:pStyle w:val="Heading1"/>
+        <w:spacing w:after="0" w:line="276" w:lineRule="auto"/>
+        <w:jc w:val="both"/>
+      </w:pPr>
+      <w:r>
+        <w:t>6</w:t>
+      </w:r>
+      <w:r>
+        <w:t>. System Architecture Overview</w:t>
+      </w:r>
+    </w:p>
+    <w:p>
+      <w:pPr>
+        <w:numPr>
+          <w:ilvl w:val="0"/>
+          <w:numId w:val="23"/>
+        </w:numPr>
+        <w:spacing w:after="0" w:line="276" w:lineRule="auto"/>
+        <w:jc w:val="both"/>
+      </w:pPr>
+      <w:r>
+        <w:t>Frontend communicates with backend via REST APIs</w:t>
+      </w:r>
+    </w:p>
+    <w:p>
+      <w:pPr>
+        <w:numPr>
+          <w:ilvl w:val="0"/>
+          <w:numId w:val="23"/>
+        </w:numPr>
+        <w:spacing w:after="0" w:line="276" w:lineRule="auto"/>
+        <w:jc w:val="both"/>
+      </w:pPr>
+      <w:r>
+        <w:t xml:space="preserve">Backend processes requests and interacts with </w:t>
+      </w:r>
+      <w:proofErr w:type="gramStart"/>
+      <w:r>
+        <w:t>database</w:t>
+      </w:r>
+      <w:proofErr w:type="gramEnd"/>
+    </w:p>
+    <w:p>
+      <w:pPr>
+        <w:numPr>
+          <w:ilvl w:val="0"/>
+          <w:numId w:val="23"/>
+        </w:numPr>
+        <w:spacing w:after="0" w:line="276" w:lineRule="auto"/>
+        <w:jc w:val="both"/>
+      </w:pPr>
+      <w:r>
+        <w:t>AI responses generated using OpenAI API</w:t>
+      </w:r>
+    </w:p>
+    <w:p>
+      <w:pPr>
+        <w:numPr>
+          <w:ilvl w:val="0"/>
+          <w:numId w:val="23"/>
+        </w:numPr>
+        <w:spacing w:after="0" w:line="276" w:lineRule="auto"/>
+        <w:jc w:val="both"/>
+      </w:pPr>
+      <w:r>
+        <w:t>Data stored in PostgreSQL</w:t>
+      </w:r>
+    </w:p>
+    <w:p>
+      <w:pPr>
+        <w:pStyle w:val="Heading1"/>
+        <w:spacing w:after="0" w:line="276" w:lineRule="auto"/>
+        <w:jc w:val="both"/>
+      </w:pPr>
+      <w:r>
+        <w:t>7</w:t>
+      </w:r>
+      <w:r>
+        <w:t>. Database Requirements</w:t>
+      </w:r>
+    </w:p>
+    <w:p>
+      <w:pPr>
+        <w:spacing w:after="0" w:line="276" w:lineRule="auto"/>
+        <w:jc w:val="both"/>
+      </w:pPr>
+      <w:r>
+        <w:t>Main entities:</w:t>
+      </w:r>
+    </w:p>
+    <w:p>
+      <w:pPr>
+        <w:numPr>
+          <w:ilvl w:val="0"/>
+          <w:numId w:val="24"/>
+        </w:numPr>
+        <w:spacing w:after="0" w:line="276" w:lineRule="auto"/>
+        <w:jc w:val="both"/>
+      </w:pPr>
+      <w:r>
+        <w:t>Users</w:t>
+      </w:r>
+    </w:p>
+    <w:p>
+      <w:pPr>
+        <w:numPr>
+          <w:ilvl w:val="0"/>
+          <w:numId w:val="24"/>
+        </w:numPr>
+        <w:spacing w:after="0" w:line="276" w:lineRule="auto"/>
+        <w:jc w:val="both"/>
+      </w:pPr>
+      <w:r>
+        <w:t>Bots</w:t>
+      </w:r>
+    </w:p>
+    <w:p>
+      <w:pPr>
+        <w:numPr>
+          <w:ilvl w:val="0"/>
+          <w:numId w:val="24"/>
+        </w:numPr>
+        <w:spacing w:after="0" w:line="276" w:lineRule="auto"/>
+        <w:jc w:val="both"/>
+      </w:pPr>
+      <w:r>
+        <w:t>Bot Chunks</w:t>
+      </w:r>
+    </w:p>
+    <w:p>
+      <w:pPr>
+        <w:numPr>
+          <w:ilvl w:val="0"/>
+          <w:numId w:val="24"/>
+        </w:numPr>
+        <w:spacing w:after="0" w:line="276" w:lineRule="auto"/>
+        <w:jc w:val="both"/>
+      </w:pPr>
+      <w:r>
+        <w:t>Conversations</w:t>
+      </w:r>
+    </w:p>
+    <w:p>
+      <w:pPr>
+        <w:numPr>
+          <w:ilvl w:val="0"/>
+          <w:numId w:val="24"/>
+        </w:numPr>
+        <w:spacing w:after="0" w:line="276" w:lineRule="auto"/>
+        <w:jc w:val="both"/>
+      </w:pPr>
+      <w:r>
+        <w:t>Messages</w:t>
+      </w:r>
+    </w:p>
+    <w:p>
+      <w:pPr>
+        <w:pStyle w:val="Heading1"/>
+        <w:spacing w:after="0" w:line="276" w:lineRule="auto"/>
+        <w:jc w:val="both"/>
+      </w:pPr>
+      <w:r>
         <w:lastRenderedPageBreak/>
-        <w:t>4.2 Security</w:t>
-      </w:r>
-    </w:p>
-    <w:p>
-      <w:pPr>
-        <w:numPr>
-          <w:ilvl w:val="0"/>
-          <w:numId w:val="19"/>
-        </w:numPr>
-        <w:spacing w:after="0" w:line="276" w:lineRule="auto"/>
-        <w:jc w:val="both"/>
-      </w:pPr>
-      <w:r>
-        <w:t>Passwords must be securely stored</w:t>
-      </w:r>
-    </w:p>
-    <w:p>
-      <w:pPr>
-        <w:numPr>
-          <w:ilvl w:val="0"/>
-          <w:numId w:val="19"/>
-        </w:numPr>
-        <w:spacing w:after="0" w:line="276" w:lineRule="auto"/>
-        <w:jc w:val="both"/>
-      </w:pPr>
-      <w:r>
-        <w:t>Admin features restricted</w:t>
-      </w:r>
-    </w:p>
-    <w:p>
-      <w:pPr>
-        <w:numPr>
-          <w:ilvl w:val="0"/>
-          <w:numId w:val="19"/>
-        </w:numPr>
-        <w:spacing w:after="0" w:line="276" w:lineRule="auto"/>
-        <w:jc w:val="both"/>
-      </w:pPr>
-      <w:r>
-        <w:t>Session-based tracking</w:t>
-      </w:r>
-    </w:p>
-    <w:p>
-      <w:pPr>
-        <w:pStyle w:val="Heading2"/>
-        <w:spacing w:after="0" w:line="276" w:lineRule="auto"/>
-        <w:jc w:val="both"/>
-      </w:pPr>
-      <w:r>
-        <w:t>4.3 Usability</w:t>
-      </w:r>
-    </w:p>
-    <w:p>
-      <w:pPr>
-        <w:numPr>
-          <w:ilvl w:val="0"/>
-          <w:numId w:val="20"/>
-        </w:numPr>
-        <w:spacing w:after="0" w:line="276" w:lineRule="auto"/>
-        <w:jc w:val="both"/>
-      </w:pPr>
-      <w:r>
-        <w:t>Simple and intuitive UI</w:t>
-      </w:r>
-    </w:p>
-    <w:p>
-      <w:pPr>
-        <w:numPr>
-          <w:ilvl w:val="0"/>
-          <w:numId w:val="20"/>
-        </w:numPr>
-        <w:spacing w:after="0" w:line="276" w:lineRule="auto"/>
-        <w:jc w:val="both"/>
-      </w:pPr>
-      <w:r>
-        <w:t>Step-by-step chatbot creation</w:t>
-      </w:r>
-    </w:p>
-    <w:p>
-      <w:pPr>
-        <w:numPr>
-          <w:ilvl w:val="0"/>
-          <w:numId w:val="20"/>
-        </w:numPr>
-        <w:spacing w:after="0" w:line="276" w:lineRule="auto"/>
-        <w:jc w:val="both"/>
-      </w:pPr>
-      <w:r>
-        <w:t>Responsive design</w:t>
-      </w:r>
-    </w:p>
-    <w:p>
-      <w:pPr>
-        <w:pStyle w:val="Heading2"/>
-        <w:spacing w:after="0" w:line="276" w:lineRule="auto"/>
-        <w:jc w:val="both"/>
-      </w:pPr>
-      <w:r>
-        <w:t>4.4 Reliability</w:t>
-      </w:r>
-    </w:p>
-    <w:p>
-      <w:pPr>
-        <w:numPr>
-          <w:ilvl w:val="0"/>
-          <w:numId w:val="21"/>
-        </w:numPr>
-        <w:spacing w:after="0" w:line="276" w:lineRule="auto"/>
-        <w:jc w:val="both"/>
-      </w:pPr>
-      <w:r>
-        <w:t>System should handle failures gracefully</w:t>
-      </w:r>
-    </w:p>
-    <w:p>
-      <w:pPr>
-        <w:numPr>
-          <w:ilvl w:val="0"/>
-          <w:numId w:val="21"/>
-        </w:numPr>
-        <w:spacing w:after="0" w:line="276" w:lineRule="auto"/>
-        <w:jc w:val="both"/>
-      </w:pPr>
-      <w:r>
-        <w:t>Fallback response if AI fails</w:t>
-      </w:r>
-    </w:p>
-    <w:p>
-      <w:pPr>
-        <w:pStyle w:val="Heading2"/>
-        <w:spacing w:after="0" w:line="276" w:lineRule="auto"/>
-        <w:jc w:val="both"/>
-      </w:pPr>
-      <w:r>
-        <w:t>4.5 Scalability</w:t>
-      </w:r>
-    </w:p>
-    <w:p>
-      <w:pPr>
-        <w:numPr>
-          <w:ilvl w:val="0"/>
-          <w:numId w:val="22"/>
-        </w:numPr>
-        <w:spacing w:after="0" w:line="276" w:lineRule="auto"/>
-        <w:jc w:val="both"/>
-      </w:pPr>
-      <w:r>
-        <w:t>System should support increasing number of users and bots</w:t>
+        <w:t>8</w:t>
+      </w:r>
+      <w:r>
+        <w:t>. Constraints</w:t>
+      </w:r>
+    </w:p>
+    <w:p>
+      <w:pPr>
+        <w:numPr>
+          <w:ilvl w:val="0"/>
+          <w:numId w:val="25"/>
+        </w:numPr>
+        <w:spacing w:after="0" w:line="276" w:lineRule="auto"/>
+        <w:jc w:val="both"/>
+      </w:pPr>
+      <w:r>
+        <w:t xml:space="preserve">Requires OpenAI API </w:t>
+      </w:r>
+      <w:proofErr w:type="gramStart"/>
+      <w:r>
+        <w:t>key</w:t>
+      </w:r>
+      <w:proofErr w:type="gramEnd"/>
+    </w:p>
+    <w:p>
+      <w:pPr>
+        <w:numPr>
+          <w:ilvl w:val="0"/>
+          <w:numId w:val="25"/>
+        </w:numPr>
+        <w:spacing w:after="0" w:line="276" w:lineRule="auto"/>
+        <w:jc w:val="both"/>
+      </w:pPr>
+      <w:r>
+        <w:t xml:space="preserve">Requires PostgreSQL </w:t>
+      </w:r>
+      <w:proofErr w:type="gramStart"/>
+      <w:r>
+        <w:t>setup</w:t>
+      </w:r>
+      <w:proofErr w:type="gramEnd"/>
+    </w:p>
+    <w:p>
+      <w:pPr>
+        <w:numPr>
+          <w:ilvl w:val="0"/>
+          <w:numId w:val="25"/>
+        </w:numPr>
+        <w:spacing w:after="0" w:line="276" w:lineRule="auto"/>
+        <w:jc w:val="both"/>
+      </w:pPr>
+      <w:r>
+        <w:t>Runs on Java 21+</w:t>
       </w:r>
     </w:p>
     <w:p>
@@ -1761,203 +2298,10 @@
         <w:jc w:val="both"/>
       </w:pPr>
       <w:r>
-        <w:t>5. System Architecture Overview</w:t>
-      </w:r>
-    </w:p>
-    <w:p>
-      <w:pPr>
-        <w:numPr>
-          <w:ilvl w:val="0"/>
-          <w:numId w:val="23"/>
-        </w:numPr>
-        <w:spacing w:after="0" w:line="276" w:lineRule="auto"/>
-        <w:jc w:val="both"/>
-      </w:pPr>
-      <w:r>
-        <w:t>Frontend communicates with backend via REST APIs</w:t>
-      </w:r>
-    </w:p>
-    <w:p>
-      <w:pPr>
-        <w:numPr>
-          <w:ilvl w:val="0"/>
-          <w:numId w:val="23"/>
-        </w:numPr>
-        <w:spacing w:after="0" w:line="276" w:lineRule="auto"/>
-        <w:jc w:val="both"/>
-      </w:pPr>
-      <w:r>
-        <w:t>Backend processes requests and interacts with database</w:t>
-      </w:r>
-    </w:p>
-    <w:p>
-      <w:pPr>
-        <w:numPr>
-          <w:ilvl w:val="0"/>
-          <w:numId w:val="23"/>
-        </w:numPr>
-        <w:spacing w:after="0" w:line="276" w:lineRule="auto"/>
-        <w:jc w:val="both"/>
-      </w:pPr>
-      <w:r>
-        <w:t>AI responses generated using OpenAI API</w:t>
-      </w:r>
-    </w:p>
-    <w:p>
-      <w:pPr>
-        <w:numPr>
-          <w:ilvl w:val="0"/>
-          <w:numId w:val="23"/>
-        </w:numPr>
-        <w:spacing w:after="0" w:line="276" w:lineRule="auto"/>
-        <w:jc w:val="both"/>
-      </w:pPr>
-      <w:r>
-        <w:t>Data stored in PostgreSQL</w:t>
-      </w:r>
-    </w:p>
-    <w:p>
-      <w:pPr>
-        <w:pStyle w:val="Heading1"/>
-        <w:spacing w:after="0" w:line="276" w:lineRule="auto"/>
-        <w:jc w:val="both"/>
-      </w:pPr>
-      <w:r>
-        <w:t>6. Database Requirements</w:t>
-      </w:r>
-    </w:p>
-    <w:p>
-      <w:pPr>
-        <w:spacing w:after="0" w:line="276" w:lineRule="auto"/>
-        <w:jc w:val="both"/>
-      </w:pPr>
-      <w:r>
-        <w:t>Main entities:</w:t>
-      </w:r>
-    </w:p>
-    <w:p>
-      <w:pPr>
-        <w:numPr>
-          <w:ilvl w:val="0"/>
-          <w:numId w:val="24"/>
-        </w:numPr>
-        <w:spacing w:after="0" w:line="276" w:lineRule="auto"/>
-        <w:jc w:val="both"/>
-      </w:pPr>
-      <w:r>
-        <w:t>Users</w:t>
-      </w:r>
-    </w:p>
-    <w:p>
-      <w:pPr>
-        <w:numPr>
-          <w:ilvl w:val="0"/>
-          <w:numId w:val="24"/>
-        </w:numPr>
-        <w:spacing w:after="0" w:line="276" w:lineRule="auto"/>
-        <w:jc w:val="both"/>
-      </w:pPr>
-      <w:r>
-        <w:t>Bots</w:t>
-      </w:r>
-    </w:p>
-    <w:p>
-      <w:pPr>
-        <w:numPr>
-          <w:ilvl w:val="0"/>
-          <w:numId w:val="24"/>
-        </w:numPr>
-        <w:spacing w:after="0" w:line="276" w:lineRule="auto"/>
-        <w:jc w:val="both"/>
-      </w:pPr>
-      <w:r>
-        <w:t>Bot Chunks</w:t>
-      </w:r>
-    </w:p>
-    <w:p>
-      <w:pPr>
-        <w:numPr>
-          <w:ilvl w:val="0"/>
-          <w:numId w:val="24"/>
-        </w:numPr>
-        <w:spacing w:after="0" w:line="276" w:lineRule="auto"/>
-        <w:jc w:val="both"/>
-      </w:pPr>
-      <w:r>
-        <w:t>Conversations</w:t>
-      </w:r>
-    </w:p>
-    <w:p>
-      <w:pPr>
-        <w:numPr>
-          <w:ilvl w:val="0"/>
-          <w:numId w:val="24"/>
-        </w:numPr>
-        <w:spacing w:after="0" w:line="276" w:lineRule="auto"/>
-        <w:jc w:val="both"/>
-      </w:pPr>
-      <w:r>
-        <w:t>Messages</w:t>
-      </w:r>
-    </w:p>
-    <w:p>
-      <w:pPr>
-        <w:pStyle w:val="Heading1"/>
-        <w:spacing w:after="0" w:line="276" w:lineRule="auto"/>
-        <w:jc w:val="both"/>
-      </w:pPr>
-      <w:r>
-        <w:t>7. Constraints</w:t>
-      </w:r>
-    </w:p>
-    <w:p>
-      <w:pPr>
-        <w:numPr>
-          <w:ilvl w:val="0"/>
-          <w:numId w:val="25"/>
-        </w:numPr>
-        <w:spacing w:after="0" w:line="276" w:lineRule="auto"/>
-        <w:jc w:val="both"/>
-      </w:pPr>
-      <w:r>
-        <w:t>Requires OpenAI API key</w:t>
-      </w:r>
-    </w:p>
-    <w:p>
-      <w:pPr>
-        <w:numPr>
-          <w:ilvl w:val="0"/>
-          <w:numId w:val="25"/>
-        </w:numPr>
-        <w:spacing w:after="0" w:line="276" w:lineRule="auto"/>
-        <w:jc w:val="both"/>
-      </w:pPr>
-      <w:r>
-        <w:t>Requires PostgreSQL setup</w:t>
-      </w:r>
-    </w:p>
-    <w:p>
-      <w:pPr>
-        <w:numPr>
-          <w:ilvl w:val="0"/>
-          <w:numId w:val="25"/>
-        </w:numPr>
-        <w:spacing w:after="0" w:line="276" w:lineRule="auto"/>
-        <w:jc w:val="both"/>
-      </w:pPr>
-      <w:r>
-        <w:t>Runs on Java 21+</w:t>
-      </w:r>
-    </w:p>
-    <w:p>
-      <w:pPr>
-        <w:pStyle w:val="Heading1"/>
-        <w:spacing w:after="0" w:line="276" w:lineRule="auto"/>
-        <w:jc w:val="both"/>
-      </w:pPr>
-      <w:r>
-        <w:lastRenderedPageBreak/>
-        <w:t>8. Future Enhancements</w:t>
+        <w:t>9</w:t>
+      </w:r>
+      <w:r>
+        <w:t>. Future Enhancements</w:t>
       </w:r>
     </w:p>
     <w:p>
@@ -2038,7 +2382,84 @@
       <w:pPr>
         <w:spacing w:after="0" w:line="276" w:lineRule="auto"/>
         <w:jc w:val="both"/>
-      </w:pPr>
+        <w:rPr>
+          <w:rFonts w:asciiTheme="majorHAnsi" w:eastAsiaTheme="majorEastAsia" w:hAnsiTheme="majorHAnsi" w:cstheme="majorBidi"/>
+          <w:color w:val="0F4761" w:themeColor="accent1" w:themeShade="BF"/>
+          <w:sz w:val="40"/>
+          <w:szCs w:val="40"/>
+        </w:rPr>
+      </w:pPr>
+      <w:r>
+        <w:rPr>
+          <w:rFonts w:asciiTheme="majorHAnsi" w:eastAsiaTheme="majorEastAsia" w:hAnsiTheme="majorHAnsi" w:cstheme="majorBidi"/>
+          <w:color w:val="0F4761" w:themeColor="accent1" w:themeShade="BF"/>
+          <w:sz w:val="40"/>
+          <w:szCs w:val="40"/>
+        </w:rPr>
+        <w:t>10</w:t>
+      </w:r>
+      <w:r>
+        <w:rPr>
+          <w:rFonts w:asciiTheme="majorHAnsi" w:eastAsiaTheme="majorEastAsia" w:hAnsiTheme="majorHAnsi" w:cstheme="majorBidi"/>
+          <w:color w:val="0F4761" w:themeColor="accent1" w:themeShade="BF"/>
+          <w:sz w:val="40"/>
+          <w:szCs w:val="40"/>
+        </w:rPr>
+        <w:t>. System Constraints</w:t>
+      </w:r>
+    </w:p>
+    <w:p>
+      <w:pPr>
+        <w:spacing w:after="0" w:line="276" w:lineRule="auto"/>
+        <w:jc w:val="both"/>
+      </w:pPr>
+      <w:r>
+        <w:t xml:space="preserve">The system </w:t>
+      </w:r>
+      <w:proofErr w:type="gramStart"/>
+      <w:r>
+        <w:t>is constrained</w:t>
+      </w:r>
+      <w:proofErr w:type="gramEnd"/>
+      <w:r>
+        <w:t xml:space="preserve"> by:</w:t>
+      </w:r>
+    </w:p>
+    <w:p>
+      <w:pPr>
+        <w:spacing w:after="0" w:line="276" w:lineRule="auto"/>
+        <w:jc w:val="both"/>
+      </w:pPr>
+      <w:r>
+        <w:t>- OpenAI API usage limits</w:t>
+      </w:r>
+    </w:p>
+    <w:p>
+      <w:pPr>
+        <w:spacing w:after="0" w:line="276" w:lineRule="auto"/>
+        <w:jc w:val="both"/>
+      </w:pPr>
+      <w:r>
+        <w:t>- PostgreSQL local deployment</w:t>
+      </w:r>
+    </w:p>
+    <w:p>
+      <w:pPr>
+        <w:spacing w:after="0" w:line="276" w:lineRule="auto"/>
+        <w:jc w:val="both"/>
+      </w:pPr>
+      <w:r>
+        <w:t>- Browser-based UI</w:t>
+      </w:r>
+    </w:p>
+    <w:p>
+      <w:pPr>
+        <w:spacing w:after="0" w:line="276" w:lineRule="auto"/>
+        <w:jc w:val="both"/>
+      </w:pPr>
+      <w:r>
+        <w:t>- Java 21 runtime requirement</w:t>
+      </w:r>
     </w:p>
     <w:sectPr>
       <w:footerReference w:type="default" r:id="rId7"/>
@@ -7396,7 +7817,6 @@
   <w:style w:type="character" w:default="1" w:styleId="DefaultParagraphFont">
     <w:name w:val="Default Paragraph Font"/>
     <w:uiPriority w:val="1"/>
-    <w:semiHidden/>
     <w:unhideWhenUsed/>
   </w:style>
   <w:style w:type="table" w:default="1" w:styleId="TableNormal">

</xml_diff>